<commit_message>
Actualizacion legal y tecnologica del Modulo XII: Derogatoria de la Providencia 121 mediante Providencia SNAT/2026/00084 y ratificacion de Providencia 00071
</commit_message>
<xml_diff>
--- a/diplomado/MODULO XII/Trabajo_Academico_Modulo_XII_Registro_Contable_Informatico.docx
+++ b/diplomado/MODULO XII/Trabajo_Academico_Modulo_XII_Registro_Contable_Informatico.docx
@@ -7,7 +7,7 @@
         <w:rPr>
           <w:rFonts w:ascii="Calibri" w:hAnsi="Calibri"/>
           <w:b/>
-          <w:color w:val="0F766E"/>
+          <w:color w:val="0891B2"/>
           <w:sz w:val="32"/>
         </w:rPr>
         <w:t>MÓDULO 12: REGISTRO CONTABLE A TRAVÉS DE APLICACIONES INFORMÁTICAS</w:t>
@@ -34,9 +34,9 @@
       </w:pPr>
       <w:r>
         <w:rPr>
-          <w:color w:val="0F766E"/>
+          <w:color w:val="0891B2"/>
         </w:rPr>
-        <w:t>UNIDAD DIDÁCTICA 1. INTRODUCCIÓN DE DATOS CONTABLES EN LA APLICACIÓN</w:t>
+        <w:t>UNIDAD DIDÁCTICA 1. INTRODUCCIÓN DE DATOS CONTABLES Y ASIENTOS PREDEFINIDOS</w:t>
       </w:r>
     </w:p>
     <w:p>
@@ -52,7 +52,7 @@
     </w:p>
     <w:p>
       <w:r>
-        <w:t>El registro contable en software garantiza la partida doble automática, la validación de montos cuadramos (Debe = Haber) y la trazabilidad de cada comprobante.</w:t>
+        <w:t>El registro contable en aplicaciones informáticas garantiza la partida doble en tiempo real, la validación de la equidad de montos (Debe = Haber) y la inalterabilidad cronológica del comprobante diario.</w:t>
       </w:r>
     </w:p>
     <w:p>
@@ -63,12 +63,12 @@
         <w:rPr>
           <w:color w:val="0F172A"/>
         </w:rPr>
-        <w:t>2. Cálculo Automático del IVA y Asientos Predefinidos</w:t>
+        <w:t>2. Cálculo Automático del IVA y Plantillas Predefinidas</w:t>
       </w:r>
     </w:p>
     <w:p>
       <w:r>
-        <w:t>Las aplicaciones informáticas incorporan plantillas de asientos predefinidos que calculan automáticamente:</w:t>
+        <w:t>Las aplicaciones incorporan plantillas de asientos tipo que calculan y desglosan automáticamente:</w:t>
       </w:r>
     </w:p>
     <w:p>
@@ -76,7 +76,7 @@
         <w:pStyle w:val="ListBullet"/>
       </w:pPr>
       <w:r>
-        <w:t>**Débito Fiscal IVA (16%):** Al registrar una factura de venta, el sistema acredita la cuenta de Ingresos y la cuenta de Débito Fiscal IVA por el 16%.</w:t>
+        <w:t>**Débito Fiscal IVA (16%):** Al registrar una factura de venta, el sistema acredita la cuenta de Ingresos y la cuenta de Débito Fiscal IVA (`2.1.02.01.001`).</w:t>
       </w:r>
     </w:p>
     <w:p>
@@ -84,7 +84,15 @@
         <w:pStyle w:val="ListBullet"/>
       </w:pPr>
       <w:r>
-        <w:t>**Crédito Fiscal IVA (16%):** Al registrar una compra, se debita la cuenta de Gastos/Inventarios y la cuenta de Crédito Fiscal IVA.</w:t>
+        <w:t>**Crédito Fiscal IVA (16%):** Al registrar una compra, se debita la cuenta de Inventario/Gastos y la cuenta de Crédito Fiscal IVA (`1.1.04.01.001`).</w:t>
+      </w:r>
+    </w:p>
+    <w:p>
+      <w:pPr>
+        <w:pStyle w:val="ListBullet"/>
+      </w:pPr>
+      <w:r>
+        <w:t>**Validación de R.I.F. y Correlativo:** Exigencia obligatoria de registrar el R.I.F. del tercero y el número de factura fiscal antes de guardar el asiento para garantizar la deducibilidad del tributo.</w:t>
       </w:r>
     </w:p>
     <w:p>
@@ -98,9 +106,9 @@
       </w:pPr>
       <w:r>
         <w:rPr>
-          <w:color w:val="0F766E"/>
+          <w:color w:val="0891B2"/>
         </w:rPr>
-        <w:t>UNIDAD DIDÁCTICA 2. GESTIÓN DE LOS LIBROS CONTABLES EN LA APLICACIÓN</w:t>
+        <w:t>UNIDAD DIDÁCTICA 2. GESTIÓN DE LIBROS CONTABLES Y FISCALES SENIAT</w:t>
       </w:r>
     </w:p>
     <w:p>
@@ -115,8 +123,11 @@
       </w:r>
     </w:p>
     <w:p>
+      <w:pPr>
+        <w:pStyle w:val="ListBullet"/>
+      </w:pPr>
       <w:r>
-        <w:t>El software permite generar de forma instantánea:</w:t>
+        <w:t>**Libro Diario Digital:** Registro cronológico de comprobantes con asignación de número correlativo inalterable (Código de Comercio Art. 36 al 44).</w:t>
       </w:r>
     </w:p>
     <w:p>
@@ -124,7 +135,7 @@
         <w:pStyle w:val="ListBullet"/>
       </w:pPr>
       <w:r>
-        <w:t>**Libro Diario Digital:** Ordenado cronológicamente con número de asiento, fecha, cuentas y concepto.</w:t>
+        <w:t>**Libro Mayor Digital:** Agrupación acumulada por cada código del árbol de cuentas a 5 niveles.</w:t>
       </w:r>
     </w:p>
     <w:p>
@@ -132,7 +143,18 @@
         <w:pStyle w:val="ListBullet"/>
       </w:pPr>
       <w:r>
-        <w:t>**Libro Mayor Digital:** Agrupado por cada código de cuenta.</w:t>
+        <w:t>**Balance de Comprobación:** Verificación de sumas y saldos antes de los procesos de cierre.</w:t>
+      </w:r>
+    </w:p>
+    <w:p>
+      <w:pPr>
+        <w:pStyle w:val="Heading2"/>
+      </w:pPr>
+      <w:r>
+        <w:rPr>
+          <w:color w:val="0F172A"/>
+        </w:rPr>
+        <w:t>2. Libros Fiscales SENIAT y Actualización Legal 2026 (Providencia 00084)</w:t>
       </w:r>
     </w:p>
     <w:p>
@@ -140,7 +162,31 @@
         <w:pStyle w:val="ListBullet"/>
       </w:pPr>
       <w:r>
-        <w:t>**Balance de Comprobación de Sumas y Saldos:** Verificación del equilibrio antes de cierres.</w:t>
+        <w:t>**Marco Legal Vigente (Providencia 00071 / 00102):** Con la emisión de la **Providencia Administrativa SNAT/2026/00084 (Gaceta Oficial N° 7.049 Extraordinario)**, la Administración Tributaria **DEROGÓ EXPRESAMENTE la Providencia SNAT/2024/000121**.</w:t>
+      </w:r>
+    </w:p>
+    <w:p>
+      <w:pPr>
+        <w:pStyle w:val="ListBullet"/>
+      </w:pPr>
+      <w:r>
+        <w:t>**Impacto para la Empresa y el Contador:** El estándar único legal para la emisión de Libros de Compras y Ventas de IVA y medios de facturación retorna exclusivamente al régimen de la **Providencia N° 00071**.</w:t>
+      </w:r>
+    </w:p>
+    <w:p>
+      <w:pPr>
+        <w:pStyle w:val="ListBullet"/>
+      </w:pPr>
+      <w:r>
+        <w:t>**Registro de Facturas Anuladas:** Las facturas anuladas DEBEN incluirse en el Libro de Ventas conservando la secuencia numérica correlativa, con monto en cero (`0,00 BS`), marcadas como "ANULADA" y conservando los ejemplares físicos/digitales soporte.</w:t>
+      </w:r>
+    </w:p>
+    <w:p>
+      <w:pPr>
+        <w:pStyle w:val="ListBullet"/>
+      </w:pPr>
+      <w:r>
+        <w:t>**Ajustes y Correcciones:** NUNCA se borran asientos pasados. Las diferencias de meses cerrados se ajustan mediante **Notas de Crédito o Débito Fiscal** con su propio correlativo en el período en curso.</w:t>
       </w:r>
     </w:p>
     <w:p>
@@ -154,7 +200,7 @@
       </w:pPr>
       <w:r>
         <w:rPr>
-          <w:color w:val="0F766E"/>
+          <w:color w:val="0891B2"/>
         </w:rPr>
         <w:t>UNIDAD DIDÁCTICA 3. REGULARIZACIÓN Y LIQUIDACIÓN DEL IVA</w:t>
       </w:r>
@@ -167,12 +213,12 @@
         <w:rPr>
           <w:color w:val="0F172A"/>
         </w:rPr>
-        <w:t>1. Proceso Mensual de Liquidación del IVA</w:t>
+        <w:t>1. Compensación Mensual entre Débito Fiscal y Crédito Fiscal SENIAT</w:t>
       </w:r>
     </w:p>
     <w:p>
       <w:r>
-        <w:t>Al cierre de cada mes, se compensan los saldos del Débito y Crédito Fiscal:</w:t>
+        <w:t>Al cierre de cada mes, el software calcula la compensación de los impuestos indirectos:</w:t>
       </w:r>
     </w:p>
     <w:p>
@@ -180,12 +226,12 @@
         <w:pStyle w:val="ListBullet"/>
       </w:pPr>
       <w:r>
-        <w:t>**Caso A (Débito Fiscal &gt; Crédito Fiscal):** Surge una cuota tributaria a pagar al SENIAT.</w:t>
+        <w:t xml:space="preserve">**Caso A (Débito Fiscal &gt; Crédito Fiscal):** Surge una cuota tributaria a pagar al SENIAT.  </w:t>
       </w:r>
     </w:p>
     <w:p>
       <w:r>
-        <w:t>- *Asiento:* Debitar Débito Fiscal, Acreditar Crédito Fiscal y Acreditar IVA por Pagar.</w:t>
+        <w:t>*Asiento:* Debitar Débito Fiscal (`2.1.02.01`), Acreditar Crédito Fiscal (`1.1.04.01`) y Acreditar IVA por Pagar SENIAT (`2.1.02.03`).</w:t>
       </w:r>
     </w:p>
     <w:p>
@@ -193,7 +239,12 @@
         <w:pStyle w:val="ListBullet"/>
       </w:pPr>
       <w:r>
-        <w:t>**Caso B (Crédito Fiscal &gt; Débito Fiscal):** Surge un excedente de crédito fiscal para el mes siguiente.</w:t>
+        <w:t xml:space="preserve">**Caso B (Crédito Fiscal &gt; Débito Fiscal):** Surge un Excedente de Crédito Fiscal para el mes siguiente.  </w:t>
+      </w:r>
+    </w:p>
+    <w:p>
+      <w:r>
+        <w:t>*Asiento:* El excedente no utilizado se registra en la cuenta de Activo Corriente **Excedente de Crédito Fiscal IVA** para ser compensado legalmente en la declaración de la Forma 30 del mes subsiguiente.</w:t>
       </w:r>
     </w:p>
     <w:p>
@@ -207,9 +258,9 @@
       </w:pPr>
       <w:r>
         <w:rPr>
-          <w:color w:val="0F766E"/>
+          <w:color w:val="0891B2"/>
         </w:rPr>
-        <w:t>UNIDAD DIDÁCTICA 4. APERTURA Y CIERRE DEL EJERCICIO ECONÓMICO</w:t>
+        <w:t>UNIDAD DIDÁCTICA 4. CIERRE FISCAL Y DEL EJERCICIO ECONÓMICO (ISLR 30%)</w:t>
       </w:r>
     </w:p>
     <w:p>
@@ -220,22 +271,27 @@
         <w:rPr>
           <w:color w:val="0F172A"/>
         </w:rPr>
-        <w:t>1. Balance de Comprobación y Cierre de Cuentas Nominal</w:t>
+        <w:t>1. Pasos del Cierre Fiscal Automatizado</w:t>
       </w:r>
     </w:p>
     <w:p>
       <w:r>
-        <w:t>1. **Cancelación de Cuentas de Resultado:** Se saldan las cuentas de Ingresos, Costos y Gastos contra la cuenta transitoria **Ganancias y Pérdidas**.</w:t>
+        <w:t>1. **Cancelación de Ingresos:** Debitar las cuentas de Ingresos contra la cuenta transitoria **Ganancias y Pérdidas**.</w:t>
       </w:r>
     </w:p>
     <w:p>
       <w:r>
-        <w:t>2. **Cálculo del Impuesto Sobre la Renta (ISLR - 30%):** Se deduce el ISLR de la utilidad contable ajustada.</w:t>
+        <w:t>2. **Cancelación de Gastos:** Acreditar las cuentas de Gastos y Costos contra **Ganancias y Pérdidas**.</w:t>
       </w:r>
     </w:p>
     <w:p>
       <w:r>
-        <w:t>3. **Traspaso al Patrimonio:** El resultado neto resultante se traslada a **Utilidades Retenidas** o **Pérdidas Acumuladas**.</w:t>
+        <w:t>3. **Cálculo del ISLR (30%):** Deducción de la provisión del Impuesto sobre la Renta sobre la utilidad contable ajustada.</w:t>
+      </w:r>
+    </w:p>
+    <w:p>
+      <w:r>
+        <w:t>4. **Traspaso al Patrimonio:** El resultado neto resultante se traslada a la cuenta patrimonial **Utilidades Retenidas** o **Resultados Acumulados**.</w:t>
       </w:r>
     </w:p>
     <w:p>
@@ -249,9 +305,9 @@
       </w:pPr>
       <w:r>
         <w:rPr>
-          <w:color w:val="0F766E"/>
+          <w:color w:val="0891B2"/>
         </w:rPr>
-        <w:t>UNIDAD DIDÁCTICA 5. OBTENCIÓN DE LAS CUENTAS ANUALES (VEN-NIF)</w:t>
+        <w:t>UNIDAD DIDÁCTICA 5. CUENTAS ANUALES ESTADOS FINANCIEROS (VEN-NIF)</w:t>
       </w:r>
     </w:p>
     <w:p>
@@ -262,7 +318,7 @@
         <w:rPr>
           <w:color w:val="0F172A"/>
         </w:rPr>
-        <w:t>1. Estados Financieros Básicos Automatizados</w:t>
+        <w:t>1. Emisión Automatizada de Estados Financieros NIIF</w:t>
       </w:r>
     </w:p>
     <w:p>
@@ -270,7 +326,7 @@
         <w:pStyle w:val="ListBullet"/>
       </w:pPr>
       <w:r>
-        <w:t>**Estado de Situación Financiera (Balance General):** Presenta Activos, Pasivos y Patrimonio a la fecha de cierre.</w:t>
+        <w:t>**Estado de Situación Financiera (Balance General):** Clasificación en Activos, Pasivos y Patrimonio a la fecha de cierre.</w:t>
       </w:r>
     </w:p>
     <w:p>
@@ -278,7 +334,15 @@
         <w:pStyle w:val="ListBullet"/>
       </w:pPr>
       <w:r>
-        <w:t>**Estado de Resultados Integrales:** Presenta el rendimiento económico del ejercicio.</w:t>
+        <w:t>**Estado de Resultados Integrales:** Medición del rendimiento económico del ejercicio.</w:t>
+      </w:r>
+    </w:p>
+    <w:p>
+      <w:pPr>
+        <w:pStyle w:val="ListBullet"/>
+      </w:pPr>
+      <w:r>
+        <w:t>**Validación de Cuadre:** Ecuación fundamental `Total Activo = Total Pasivo + Patrimonio`.</w:t>
       </w:r>
     </w:p>
     <w:p>
@@ -292,9 +356,9 @@
       </w:pPr>
       <w:r>
         <w:rPr>
-          <w:color w:val="0F766E"/>
+          <w:color w:val="0891B2"/>
         </w:rPr>
-        <w:t>UNIDAD DIDÁCTICA 6. RESPONSABILIDAD Y CONFIDENCIALIDAD EN EL REGISTRO CONTABLE</w:t>
+        <w:t>UNIDAD DIDÁCTICA 6. RESPONSABILIDAD LEGAL, CONFIDENCIALIDAD Y ÉTICA PROFESIONAL</w:t>
       </w:r>
     </w:p>
     <w:p>
@@ -305,12 +369,7 @@
         <w:rPr>
           <w:color w:val="0F172A"/>
         </w:rPr>
-        <w:t>1. Código de Ética y Segregación de Roles</w:t>
-      </w:r>
-    </w:p>
-    <w:p>
-      <w:r>
-        <w:t>El contador que opera sistemas informáticos debe velar por:</w:t>
+        <w:t>1. Responsabilidad Legal y Código de Comercio</w:t>
       </w:r>
     </w:p>
     <w:p>
@@ -318,7 +377,7 @@
         <w:pStyle w:val="ListBullet"/>
       </w:pPr>
       <w:r>
-        <w:t>**Confidencialidad:** Mantener el secreto profesional sobre las cifras contables.</w:t>
+        <w:t>**Conservación de Libros (Art. 44 del Código de Comercio):** Obligatoriedad de conservar todos los libros contables y comprobantes digitales durante al menos **10 años**.</w:t>
       </w:r>
     </w:p>
     <w:p>
@@ -326,7 +385,26 @@
         <w:pStyle w:val="ListBullet"/>
       </w:pPr>
       <w:r>
-        <w:t>**Segregación de Accesos:** Asignar perfiles diferenciados en el software (Facturación, Tesorería, Contador General y Auditor).</w:t>
+        <w:t>**Código de Ética del Contador Público (FCCPV):** Responsabilidad civil, administrativa y penal por veracidad de cifras.</w:t>
+      </w:r>
+    </w:p>
+    <w:p>
+      <w:pPr>
+        <w:pStyle w:val="Heading2"/>
+      </w:pPr>
+      <w:r>
+        <w:rPr>
+          <w:color w:val="0F172A"/>
+        </w:rPr>
+        <w:t>2. Confidencialidad y Segregación de Roles</w:t>
+      </w:r>
+    </w:p>
+    <w:p>
+      <w:pPr>
+        <w:pStyle w:val="ListBullet"/>
+      </w:pPr>
+      <w:r>
+        <w:t>**Segregación de Funciones en el Software:** Configuración de perfiles diferenciados (Facturación, Tesorería, Contador General y Auditor) para evitar fraudes y garantizar la integridad interna.</w:t>
       </w:r>
     </w:p>
     <w:sectPr>

</xml_diff>